<commit_message>
Add 3x2 course tiering matrix + lock into Skill & validation rules
- docs/Course_Tiered_Matrix.{html,docx}: 3层(3/7/14h,AVG占50%)x2类(C1通用改编/C2定制业务赋能)矩阵、50/50时间模型、六单元格详述、11项盲区、资产打通
- skill: 新增 references/course_tiering.md；SKILL.md 加第8心法+索引；validation_rules 增 VR-TIER(43条)
- scripts/gen_tier_matrix.py: 单源生成器纳入仓库
- README 更新结构与版本（rules 38->43）
</commit_message>
<xml_diff>
--- a/docs/Capability_Assets.docx
+++ b/docs/Capability_Assets.docx
@@ -561,6 +561,38 @@
           </w:p>
         </w:tc>
       </w:tr>
+      <w:tr>
+        <w:tc>
+          <w:tcPr>
+            <w:tcW w:type="dxa" w:w="2880"/>
+          </w:tcPr>
+          <w:p>
+            <w:r>
+              <w:t>`references/course_tiering.md`</w:t>
+            </w:r>
+          </w:p>
+        </w:tc>
+        <w:tc>
+          <w:tcPr>
+            <w:tcW w:type="dxa" w:w="2880"/>
+          </w:tcPr>
+          <w:p>
+            <w:r>
+              <w:t>课程产品分层模型（3 层×2 类 矩阵、50/50 时间、盲区、资产打通）</w:t>
+            </w:r>
+          </w:p>
+        </w:tc>
+        <w:tc>
+          <w:tcPr>
+            <w:tcW w:type="dxa" w:w="2880"/>
+          </w:tcPr>
+          <w:p>
+            <w:r>
+              <w:t>定价/交付/生产轴</w:t>
+            </w:r>
+          </w:p>
+        </w:tc>
+      </w:tr>
     </w:tbl>
     <w:p>
       <w:pPr>
@@ -570,7 +602,7 @@
         <w:rPr>
           <w:rFonts w:ascii="Microsoft YaHei" w:hAnsi="Microsoft YaHei" w:eastAsia="Microsoft YaHei"/>
         </w:rPr>
-        <w:t>七条跨领域心法（调用前先读）</w:t>
+        <w:t>八条跨领域心法（调用前先读）</w:t>
       </w:r>
     </w:p>
     <w:p>
@@ -720,6 +752,47 @@
           <w:rFonts w:ascii="Microsoft YaHei" w:hAnsi="Microsoft YaHei" w:eastAsia="Microsoft YaHei"/>
         </w:rPr>
         <w:t xml:space="preserve">   **没有这条，学习与产品不成立**（校验 VR-RE05）。详见仓库 `docs/Core_Design_Assumption`。</w:t>
+      </w:r>
+    </w:p>
+    <w:p>
+      <w:pPr>
+        <w:pStyle w:val="ListNumber"/>
+      </w:pPr>
+      <w:r>
+        <w:rPr>
+          <w:rFonts w:ascii="Microsoft YaHei" w:hAnsi="Microsoft YaHei" w:eastAsia="Microsoft YaHei"/>
+        </w:rPr>
+        <w:t>**产品分层 3×2 矩阵（定价 / 交付 / 生产轴）**：课程产品按【复杂度/时长 3 层 × 定制化程度 2 类】结构化。</w:t>
+      </w:r>
+    </w:p>
+    <w:p>
+      <w:pPr>
+        <w:pStyle w:val="ListBullet"/>
+      </w:pPr>
+      <w:r>
+        <w:rPr>
+          <w:rFonts w:ascii="Microsoft YaHei" w:hAnsi="Microsoft YaHei" w:eastAsia="Microsoft YaHei"/>
+        </w:rPr>
+        <w:t>3 层：L1 3h / L2 7h / L3 14h，AVG 探索固定占 **50%**，另 50% 为 导入 + 复盘结构化产出 + 工作场景应用 + 个人行为改变计划（IDP）。</w:t>
+      </w:r>
+    </w:p>
+    <w:p>
+      <w:pPr>
+        <w:pStyle w:val="ListBullet"/>
+      </w:pPr>
+      <w:r>
+        <w:rPr>
+          <w:rFonts w:ascii="Microsoft YaHei" w:hAnsi="Microsoft YaHei" w:eastAsia="Microsoft YaHei"/>
+        </w:rPr>
+        <w:t>2 类：C1 通用改编（已有课程转译）/ C2 定制业务赋能（先**萃取**再构建学习目标/内容/场景/能力/评价）。</w:t>
+      </w:r>
+    </w:p>
+    <w:p>
+      <w:r>
+        <w:rPr>
+          <w:rFonts w:ascii="Microsoft YaHei" w:hAnsi="Microsoft YaHei" w:eastAsia="Microsoft YaHei"/>
+        </w:rPr>
+        <w:t xml:space="preserve">   设计任一门课先定 Tier 与 Track——它决定 AI 生成深度、离线包规格与定价套餐。详见 `docs/Course_Tiered_Matrix` 与 `references/course_tiering.md`。</w:t>
       </w:r>
     </w:p>
     <w:p>
@@ -9521,6 +9594,404 @@
           <w:p>
             <w:r>
               <w:t>自动</w:t>
+            </w:r>
+          </w:p>
+        </w:tc>
+      </w:tr>
+    </w:tbl>
+    <w:p>
+      <w:pPr>
+        <w:pStyle w:val="Heading3"/>
+      </w:pPr>
+      <w:r>
+        <w:rPr>
+          <w:rFonts w:ascii="Microsoft YaHei" w:hAnsi="Microsoft YaHei" w:eastAsia="Microsoft YaHei"/>
+        </w:rPr>
+        <w:t>分层（3×2 矩阵）</w:t>
+      </w:r>
+    </w:p>
+    <w:tbl>
+      <w:tblPr>
+        <w:tblStyle w:val="TableGrid"/>
+        <w:tblW w:type="auto" w:w="0"/>
+        <w:tblLook w:firstColumn="1" w:firstRow="1" w:lastColumn="0" w:lastRow="0" w:noHBand="0" w:noVBand="1" w:val="04A0"/>
+      </w:tblPr>
+      <w:tblGrid>
+        <w:gridCol w:w="1440"/>
+        <w:gridCol w:w="1440"/>
+        <w:gridCol w:w="1440"/>
+        <w:gridCol w:w="1440"/>
+        <w:gridCol w:w="1440"/>
+        <w:gridCol w:w="1440"/>
+      </w:tblGrid>
+      <w:tr>
+        <w:tc>
+          <w:tcPr>
+            <w:tcW w:type="dxa" w:w="1440"/>
+          </w:tcPr>
+          <w:p>
+            <w:r>
+              <w:t>规则ID</w:t>
+            </w:r>
+          </w:p>
+        </w:tc>
+        <w:tc>
+          <w:tcPr>
+            <w:tcW w:type="dxa" w:w="1440"/>
+          </w:tcPr>
+          <w:p>
+            <w:r>
+              <w:t>检查对象 / JSON 路径</w:t>
+            </w:r>
+          </w:p>
+        </w:tc>
+        <w:tc>
+          <w:tcPr>
+            <w:tcW w:type="dxa" w:w="1440"/>
+          </w:tcPr>
+          <w:p>
+            <w:r>
+              <w:t>自动条件（伪代码）</w:t>
+            </w:r>
+          </w:p>
+        </w:tc>
+        <w:tc>
+          <w:tcPr>
+            <w:tcW w:type="dxa" w:w="1440"/>
+          </w:tcPr>
+          <w:p>
+            <w:r>
+              <w:t>严重度</w:t>
+            </w:r>
+          </w:p>
+        </w:tc>
+        <w:tc>
+          <w:tcPr>
+            <w:tcW w:type="dxa" w:w="1440"/>
+          </w:tcPr>
+          <w:p>
+            <w:r>
+              <w:t>失败信息</w:t>
+            </w:r>
+          </w:p>
+        </w:tc>
+        <w:tc>
+          <w:tcPr>
+            <w:tcW w:type="dxa" w:w="1440"/>
+          </w:tcPr>
+          <w:p>
+            <w:r>
+              <w:t>执行</w:t>
+            </w:r>
+          </w:p>
+        </w:tc>
+      </w:tr>
+      <w:tr>
+        <w:tc>
+          <w:tcPr>
+            <w:tcW w:type="dxa" w:w="1440"/>
+          </w:tcPr>
+          <w:p>
+            <w:r>
+              <w:t>`VR-TIER01`</w:t>
+            </w:r>
+          </w:p>
+        </w:tc>
+        <w:tc>
+          <w:tcPr>
+            <w:tcW w:type="dxa" w:w="1440"/>
+          </w:tcPr>
+          <w:p>
+            <w:r>
+              <w:t>`kit.totalDuration / stages.avgDuration`</w:t>
+            </w:r>
+          </w:p>
+        </w:tc>
+        <w:tc>
+          <w:tcPr>
+            <w:tcW w:type="dxa" w:w="1440"/>
+          </w:tcPr>
+          <w:p>
+            <w:r>
+              <w:t>avgDuration == totalDuration * 0.5（AVG 探索体验严格占 50%）</w:t>
+            </w:r>
+          </w:p>
+        </w:tc>
+        <w:tc>
+          <w:tcPr>
+            <w:tcW w:type="dxa" w:w="1440"/>
+          </w:tcPr>
+          <w:p>
+            <w:r>
+              <w:t>**BLOCKER**</w:t>
+            </w:r>
+          </w:p>
+        </w:tc>
+        <w:tc>
+          <w:tcPr>
+            <w:tcW w:type="dxa" w:w="1440"/>
+          </w:tcPr>
+          <w:p>
+            <w:r>
+              <w:t>AVG 时长未占总时长 50%，违反核心时间约束</w:t>
+            </w:r>
+          </w:p>
+        </w:tc>
+        <w:tc>
+          <w:tcPr>
+            <w:tcW w:type="dxa" w:w="1440"/>
+          </w:tcPr>
+          <w:p>
+            <w:r>
+              <w:t>自动</w:t>
+            </w:r>
+          </w:p>
+        </w:tc>
+      </w:tr>
+      <w:tr>
+        <w:tc>
+          <w:tcPr>
+            <w:tcW w:type="dxa" w:w="1440"/>
+          </w:tcPr>
+          <w:p>
+            <w:r>
+              <w:t>`VR-TIER02`</w:t>
+            </w:r>
+          </w:p>
+        </w:tc>
+        <w:tc>
+          <w:tcPr>
+            <w:tcW w:type="dxa" w:w="1440"/>
+          </w:tcPr>
+          <w:p>
+            <w:r>
+              <w:t>`stages.import / stages.reflection / stages.application / stages.idp`</w:t>
+            </w:r>
+          </w:p>
+        </w:tc>
+        <w:tc>
+          <w:tcPr>
+            <w:tcW w:type="dxa" w:w="1440"/>
+          </w:tcPr>
+          <w:p>
+            <w:r>
+              <w:t>非 AVG 四活动齐全：导入/复盘/应用/IDP 均存在且非空</w:t>
+            </w:r>
+          </w:p>
+        </w:tc>
+        <w:tc>
+          <w:tcPr>
+            <w:tcW w:type="dxa" w:w="1440"/>
+          </w:tcPr>
+          <w:p>
+            <w:r>
+              <w:t>**BLOCKER**</w:t>
+            </w:r>
+          </w:p>
+        </w:tc>
+        <w:tc>
+          <w:tcPr>
+            <w:tcW w:type="dxa" w:w="1440"/>
+          </w:tcPr>
+          <w:p>
+            <w:r>
+              <w:t>非 AVG 50% 的四项活动缺失，培训无法落地</w:t>
+            </w:r>
+          </w:p>
+        </w:tc>
+        <w:tc>
+          <w:tcPr>
+            <w:tcW w:type="dxa" w:w="1440"/>
+          </w:tcPr>
+          <w:p>
+            <w:r>
+              <w:t>自动</w:t>
+            </w:r>
+          </w:p>
+        </w:tc>
+      </w:tr>
+      <w:tr>
+        <w:tc>
+          <w:tcPr>
+            <w:tcW w:type="dxa" w:w="1440"/>
+          </w:tcPr>
+          <w:p>
+            <w:r>
+              <w:t>`VR-TIER03`</w:t>
+            </w:r>
+          </w:p>
+        </w:tc>
+        <w:tc>
+          <w:tcPr>
+            <w:tcW w:type="dxa" w:w="1440"/>
+          </w:tcPr>
+          <w:p>
+            <w:r>
+              <w:t>`kit.extraction / kit.competencyModel`</w:t>
+            </w:r>
+          </w:p>
+        </w:tc>
+        <w:tc>
+          <w:tcPr>
+            <w:tcW w:type="dxa" w:w="1440"/>
+          </w:tcPr>
+          <w:p>
+            <w:r>
+              <w:t>Track=C2 时必含 extraction 与 competencyModel；C1 可豁免</w:t>
+            </w:r>
+          </w:p>
+        </w:tc>
+        <w:tc>
+          <w:tcPr>
+            <w:tcW w:type="dxa" w:w="1440"/>
+          </w:tcPr>
+          <w:p>
+            <w:r>
+              <w:t>**WARN**</w:t>
+            </w:r>
+          </w:p>
+        </w:tc>
+        <w:tc>
+          <w:tcPr>
+            <w:tcW w:type="dxa" w:w="1440"/>
+          </w:tcPr>
+          <w:p>
+            <w:r>
+              <w:t>C2 缺少萃取阶段或能力模型</w:t>
+            </w:r>
+          </w:p>
+        </w:tc>
+        <w:tc>
+          <w:tcPr>
+            <w:tcW w:type="dxa" w:w="1440"/>
+          </w:tcPr>
+          <w:p>
+            <w:r>
+              <w:t>自动</w:t>
+            </w:r>
+          </w:p>
+        </w:tc>
+      </w:tr>
+      <w:tr>
+        <w:tc>
+          <w:tcPr>
+            <w:tcW w:type="dxa" w:w="1440"/>
+          </w:tcPr>
+          <w:p>
+            <w:r>
+              <w:t>`VR-TIER04`</w:t>
+            </w:r>
+          </w:p>
+        </w:tc>
+        <w:tc>
+          <w:tcPr>
+            <w:tcW w:type="dxa" w:w="1440"/>
+          </w:tcPr>
+          <w:p>
+            <w:r>
+              <w:t>`stages.decisions`</w:t>
+            </w:r>
+          </w:p>
+        </w:tc>
+        <w:tc>
+          <w:tcPr>
+            <w:tcW w:type="dxa" w:w="1440"/>
+          </w:tcPr>
+          <w:p>
+            <w:r>
+              <w:t>决策节点最小数：L1≥1 / L2≥3 / L3≥5（按 kit.tier 校验）</w:t>
+            </w:r>
+          </w:p>
+        </w:tc>
+        <w:tc>
+          <w:tcPr>
+            <w:tcW w:type="dxa" w:w="1440"/>
+          </w:tcPr>
+          <w:p>
+            <w:r>
+              <w:t>**WARN**</w:t>
+            </w:r>
+          </w:p>
+        </w:tc>
+        <w:tc>
+          <w:tcPr>
+            <w:tcW w:type="dxa" w:w="1440"/>
+          </w:tcPr>
+          <w:p>
+            <w:r>
+              <w:t>该层决策节点数低于复杂度下限</w:t>
+            </w:r>
+          </w:p>
+        </w:tc>
+        <w:tc>
+          <w:tcPr>
+            <w:tcW w:type="dxa" w:w="1440"/>
+          </w:tcPr>
+          <w:p>
+            <w:r>
+              <w:t>自动</w:t>
+            </w:r>
+          </w:p>
+        </w:tc>
+      </w:tr>
+      <w:tr>
+        <w:tc>
+          <w:tcPr>
+            <w:tcW w:type="dxa" w:w="1440"/>
+          </w:tcPr>
+          <w:p>
+            <w:r>
+              <w:t>`VR-TIER05`</w:t>
+            </w:r>
+          </w:p>
+        </w:tc>
+        <w:tc>
+          <w:tcPr>
+            <w:tcW w:type="dxa" w:w="1440"/>
+          </w:tcPr>
+          <w:p>
+            <w:r>
+              <w:t>`kit.priceAnchor / kit.effortAnchor`</w:t>
+            </w:r>
+          </w:p>
+        </w:tc>
+        <w:tc>
+          <w:tcPr>
+            <w:tcW w:type="dxa" w:w="1440"/>
+          </w:tcPr>
+          <w:p>
+            <w:r>
+              <w:t>与 tier×track 建议区间匹配（L1·C1 0.5-1d/¥3-8K … L3·C2 10-20d/¥80-200K+）</w:t>
+            </w:r>
+          </w:p>
+        </w:tc>
+        <w:tc>
+          <w:tcPr>
+            <w:tcW w:type="dxa" w:w="1440"/>
+          </w:tcPr>
+          <w:p>
+            <w:r>
+              <w:t>**INFO**</w:t>
+            </w:r>
+          </w:p>
+        </w:tc>
+        <w:tc>
+          <w:tcPr>
+            <w:tcW w:type="dxa" w:w="1440"/>
+          </w:tcPr>
+          <w:p>
+            <w:r>
+              <w:t>定价/工时锚偏离分层建议区间（人工复核）</w:t>
+            </w:r>
+          </w:p>
+        </w:tc>
+        <w:tc>
+          <w:tcPr>
+            <w:tcW w:type="dxa" w:w="1440"/>
+          </w:tcPr>
+          <w:p>
+            <w:r>
+              <w:t>人工</w:t>
             </w:r>
           </w:p>
         </w:tc>
@@ -11468,6 +11939,492 @@
           <w:rFonts w:ascii="Microsoft YaHei" w:hAnsi="Microsoft YaHei" w:eastAsia="Microsoft YaHei"/>
         </w:rPr>
         <w:t>终检 → 调用 `validation_rules.md` 的 VR-OFF* 规则。</w:t>
+      </w:r>
+    </w:p>
+    <w:p>
+      <w:pPr>
+        <w:pStyle w:val="Heading1"/>
+      </w:pPr>
+      <w:r>
+        <w:rPr>
+          <w:rFonts w:ascii="Microsoft YaHei" w:hAnsi="Microsoft YaHei" w:eastAsia="Microsoft YaHei"/>
+        </w:rPr>
+        <w:t>07 · 课程产品分层模型（3×2）</w:t>
+      </w:r>
+    </w:p>
+    <w:p>
+      <w:pPr>
+        <w:pStyle w:val="Heading1"/>
+      </w:pPr>
+      <w:r>
+        <w:rPr>
+          <w:rFonts w:ascii="Microsoft YaHei" w:hAnsi="Microsoft YaHei" w:eastAsia="Microsoft YaHei"/>
+        </w:rPr>
+        <w:t>课程产品分层模型（3×2 矩阵）</w:t>
+      </w:r>
+    </w:p>
+    <w:p>
+      <w:pPr>
+        <w:pStyle w:val="IntenseQuote"/>
+      </w:pPr>
+      <w:r>
+        <w:rPr>
+          <w:rFonts w:ascii="Microsoft YaHei" w:hAnsi="Microsoft YaHei" w:eastAsia="Microsoft YaHei"/>
+        </w:rPr>
+        <w:t>何时调用：当用户要定义「这门课该做成哪一档产品」「定价套餐」「AI 生成深度」「离线包规格」， 或设计某门课程的 Tier（L1/L2/L3）与 Track（C1/C2）时调用。完整文档见仓库 `docs/Course_Tiered_Matrix.*`。</w:t>
+      </w:r>
+    </w:p>
+    <w:p>
+      <w:pPr>
+        <w:pStyle w:val="Heading2"/>
+      </w:pPr>
+      <w:r>
+        <w:rPr>
+          <w:rFonts w:ascii="Microsoft YaHei" w:hAnsi="Microsoft YaHei" w:eastAsia="Microsoft YaHei"/>
+        </w:rPr>
+        <w:t>一、两个维度</w:t>
+      </w:r>
+    </w:p>
+    <w:p>
+      <w:r>
+        <w:rPr>
+          <w:rFonts w:ascii="Microsoft YaHei" w:hAnsi="Microsoft YaHei" w:eastAsia="Microsoft YaHei"/>
+        </w:rPr>
+        <w:t>**维度一 · 3 层（Tier）—— 按内容/场景复杂度与系统程度，对应总学习时长**</w:t>
+      </w:r>
+    </w:p>
+    <w:p>
+      <w:pPr>
+        <w:pStyle w:val="ListBullet"/>
+      </w:pPr>
+      <w:r>
+        <w:rPr>
+          <w:rFonts w:ascii="Microsoft YaHei" w:hAnsi="Microsoft YaHei" w:eastAsia="Microsoft YaHei"/>
+        </w:rPr>
+        <w:t>L1 轻量切片：3h，AVG 1.5h，单模块 / 单一能力点，单角色单决策链 2–3 结局。</w:t>
+      </w:r>
+    </w:p>
+    <w:p>
+      <w:pPr>
+        <w:pStyle w:val="ListBullet"/>
+      </w:pPr>
+      <w:r>
+        <w:rPr>
+          <w:rFonts w:ascii="Microsoft YaHei" w:hAnsi="Microsoft YaHei" w:eastAsia="Microsoft YaHei"/>
+        </w:rPr>
+        <w:t>L2 标准单元：7h，AVG 3.5h，完整主题 / 2–3 能力点，2–3 角色多结局轻状态。</w:t>
+      </w:r>
+    </w:p>
+    <w:p>
+      <w:pPr>
+        <w:pStyle w:val="ListBullet"/>
+      </w:pPr>
+      <w:r>
+        <w:rPr>
+          <w:rFonts w:ascii="Microsoft YaHei" w:hAnsi="Microsoft YaHei" w:eastAsia="Microsoft YaHei"/>
+        </w:rPr>
+        <w:t>L3 深度系列：14h，AVG 7h，多模块 / 系统能力，多视角深度分支状态系统多轮复盘。</w:t>
+      </w:r>
+    </w:p>
+    <w:p>
+      <w:r>
+        <w:rPr>
+          <w:rFonts w:ascii="Microsoft YaHei" w:hAnsi="Microsoft YaHei" w:eastAsia="Microsoft YaHei"/>
+        </w:rPr>
+        <w:t>**维度二 · 2 类（Track）—— 按定制化程度**</w:t>
+      </w:r>
+    </w:p>
+    <w:p>
+      <w:pPr>
+        <w:pStyle w:val="ListBullet"/>
+      </w:pPr>
+      <w:r>
+        <w:rPr>
+          <w:rFonts w:ascii="Microsoft YaHei" w:hAnsi="Microsoft YaHei" w:eastAsia="Microsoft YaHei"/>
+        </w:rPr>
+        <w:t>C1 通用改编（Existing-to-AVG）：输入=已有成熟课程（PPT+教材），流程=转译现有 LGM，交付=标准盒装包，定价=订阅/按门改编。</w:t>
+      </w:r>
+    </w:p>
+    <w:p>
+      <w:pPr>
+        <w:pStyle w:val="ListBullet"/>
+      </w:pPr>
+      <w:r>
+        <w:rPr>
+          <w:rFonts w:ascii="Microsoft YaHei" w:hAnsi="Microsoft YaHei" w:eastAsia="Microsoft YaHei"/>
+        </w:rPr>
+        <w:t>C2 定制业务赋能（Bespoke Enablement）：输入=业务目标+真实案例，流程=**先萃取**（主题建模→关键事件访谈→能力建模→场景挑战→评价设计），交付=定制包（萃取报告+能力模型+定制场景库+评价量表），定价=项目制。</w:t>
+      </w:r>
+    </w:p>
+    <w:p>
+      <w:pPr>
+        <w:pStyle w:val="Heading2"/>
+      </w:pPr>
+      <w:r>
+        <w:rPr>
+          <w:rFonts w:ascii="Microsoft YaHei" w:hAnsi="Microsoft YaHei" w:eastAsia="Microsoft YaHei"/>
+        </w:rPr>
+        <w:t>二、六单元格速查</w:t>
+      </w:r>
+    </w:p>
+    <w:tbl>
+      <w:tblPr>
+        <w:tblStyle w:val="TableGrid"/>
+        <w:tblW w:type="auto" w:w="0"/>
+        <w:tblLook w:firstColumn="1" w:firstRow="1" w:lastColumn="0" w:lastRow="0" w:noHBand="0" w:noVBand="1" w:val="04A0"/>
+      </w:tblPr>
+      <w:tblGrid>
+        <w:gridCol w:w="2880"/>
+        <w:gridCol w:w="2880"/>
+        <w:gridCol w:w="2880"/>
+      </w:tblGrid>
+      <w:tr>
+        <w:tc>
+          <w:tcPr>
+            <w:tcW w:type="dxa" w:w="2880"/>
+          </w:tcPr>
+          <w:p>
+            <w:r/>
+          </w:p>
+        </w:tc>
+        <w:tc>
+          <w:tcPr>
+            <w:tcW w:type="dxa" w:w="2880"/>
+          </w:tcPr>
+          <w:p>
+            <w:r>
+              <w:t>C1 通用改编</w:t>
+            </w:r>
+          </w:p>
+        </w:tc>
+        <w:tc>
+          <w:tcPr>
+            <w:tcW w:type="dxa" w:w="2880"/>
+          </w:tcPr>
+          <w:p>
+            <w:r>
+              <w:t>C2 定制业务赋能</w:t>
+            </w:r>
+          </w:p>
+        </w:tc>
+      </w:tr>
+      <w:tr>
+        <w:tc>
+          <w:tcPr>
+            <w:tcW w:type="dxa" w:w="2880"/>
+          </w:tcPr>
+          <w:p>
+            <w:r>
+              <w:t>**L1 (3h)**</w:t>
+            </w:r>
+          </w:p>
+        </w:tc>
+        <w:tc>
+          <w:tcPr>
+            <w:tcW w:type="dxa" w:w="2880"/>
+          </w:tcPr>
+          <w:p>
+            <w:r>
+              <w:t>情境领导·单模块切片（如诊断下属成熟度）</w:t>
+            </w:r>
+          </w:p>
+        </w:tc>
+        <w:tc>
+          <w:tcPr>
+            <w:tcW w:type="dxa" w:w="2880"/>
+          </w:tcPr>
+          <w:p>
+            <w:r>
+              <w:t>物业经理·单事件切片（如一次收并购谈判）</w:t>
+            </w:r>
+          </w:p>
+        </w:tc>
+      </w:tr>
+      <w:tr>
+        <w:tc>
+          <w:tcPr>
+            <w:tcW w:type="dxa" w:w="2880"/>
+          </w:tcPr>
+          <w:p>
+            <w:r>
+              <w:t>**L2 (7h)**</w:t>
+            </w:r>
+          </w:p>
+        </w:tc>
+        <w:tc>
+          <w:tcPr>
+            <w:tcW w:type="dxa" w:w="2880"/>
+          </w:tcPr>
+          <w:p>
+            <w:r>
+              <w:t>情境领导·完整课（S1–S4+两难）</w:t>
+            </w:r>
+          </w:p>
+        </w:tc>
+        <w:tc>
+          <w:tcPr>
+            <w:tcW w:type="dxa" w:w="2880"/>
+          </w:tcPr>
+          <w:p>
+            <w:r>
+              <w:t>物业经理·市场拓展完整赋能</w:t>
+            </w:r>
+          </w:p>
+        </w:tc>
+      </w:tr>
+      <w:tr>
+        <w:tc>
+          <w:tcPr>
+            <w:tcW w:type="dxa" w:w="2880"/>
+          </w:tcPr>
+          <w:p>
+            <w:r>
+              <w:t>**L3 (14h)**</w:t>
+            </w:r>
+          </w:p>
+        </w:tc>
+        <w:tc>
+          <w:tcPr>
+            <w:tcW w:type="dxa" w:w="2880"/>
+          </w:tcPr>
+          <w:p>
+            <w:r>
+              <w:t>领导力系列（多模块）</w:t>
+            </w:r>
+          </w:p>
+        </w:tc>
+        <w:tc>
+          <w:tcPr>
+            <w:tcW w:type="dxa" w:w="2880"/>
+          </w:tcPr>
+          <w:p>
+            <w:r>
+              <w:t>物业经理·市场拓展与收并购全业务赋能</w:t>
+            </w:r>
+          </w:p>
+        </w:tc>
+      </w:tr>
+    </w:tbl>
+    <w:p>
+      <w:r>
+        <w:rPr>
+          <w:rFonts w:ascii="Microsoft YaHei" w:hAnsi="Microsoft YaHei" w:eastAsia="Microsoft YaHei"/>
+        </w:rPr>
+        <w:t>工时锚（AI+专家）：L1·C1 0.5–1d｜L1·C2 2–3d｜L2·C1 1–2d｜L2·C2 5–8d｜L3·C1 3–5d｜L3·C2 10–20d。 定价锚（建议）：C1 ¥3K–50K/门（订阅摊薄）｜C2 ¥8K–200K+（项目制）。</w:t>
+      </w:r>
+    </w:p>
+    <w:p>
+      <w:pPr>
+        <w:pStyle w:val="Heading2"/>
+      </w:pPr>
+      <w:r>
+        <w:rPr>
+          <w:rFonts w:ascii="Microsoft YaHei" w:hAnsi="Microsoft YaHei" w:eastAsia="Microsoft YaHei"/>
+        </w:rPr>
+        <w:t>三、50 / 50 时间分配（核心约束，VR-TIER01/02 强制）</w:t>
+      </w:r>
+    </w:p>
+    <w:p>
+      <w:r>
+        <w:rPr>
+          <w:rFonts w:ascii="Microsoft YaHei" w:hAnsi="Microsoft YaHei" w:eastAsia="Microsoft YaHei"/>
+        </w:rPr>
+        <w:t>AVG 探索体验固定占**总时长 50%**；另 50% 为非 AVG 工作坊，由四项构成，且每门课都必须齐全： ① 导入（情境铺垫/目标共识）② 复盘结构化产出（AAR+可带走产出物）③ 工作场景应用（当堂迁移真实任务）④ 个人行为改变计划 IDP（30–60 天契约）。</w:t>
+      </w:r>
+    </w:p>
+    <w:p>
+      <w:r>
+        <w:rPr>
+          <w:rFonts w:ascii="Microsoft YaHei" w:hAnsi="Microsoft YaHei" w:eastAsia="Microsoft YaHei"/>
+        </w:rPr>
+        <w:t>四活动在 50% 内的分层权重（设计建议）：</w:t>
+      </w:r>
+    </w:p>
+    <w:p>
+      <w:pPr>
+        <w:pStyle w:val="ListBullet"/>
+      </w:pPr>
+      <w:r>
+        <w:rPr>
+          <w:rFonts w:ascii="Microsoft YaHei" w:hAnsi="Microsoft YaHei" w:eastAsia="Microsoft YaHei"/>
+        </w:rPr>
+        <w:t>L1：导入 40 / 复盘 35 / 应用 15 / IDP 10</w:t>
+      </w:r>
+    </w:p>
+    <w:p>
+      <w:pPr>
+        <w:pStyle w:val="ListBullet"/>
+      </w:pPr>
+      <w:r>
+        <w:rPr>
+          <w:rFonts w:ascii="Microsoft YaHei" w:hAnsi="Microsoft YaHei" w:eastAsia="Microsoft YaHei"/>
+        </w:rPr>
+        <w:t>L2：导入 25 / 复盘 30 / 应用 25 / IDP 20</w:t>
+      </w:r>
+    </w:p>
+    <w:p>
+      <w:pPr>
+        <w:pStyle w:val="ListBullet"/>
+      </w:pPr>
+      <w:r>
+        <w:rPr>
+          <w:rFonts w:ascii="Microsoft YaHei" w:hAnsi="Microsoft YaHei" w:eastAsia="Microsoft YaHei"/>
+        </w:rPr>
+        <w:t>L3：导入 15 / 复盘 25 / 应用 35 / IDP 25</w:t>
+      </w:r>
+    </w:p>
+    <w:p>
+      <w:pPr>
+        <w:pStyle w:val="IntenseQuote"/>
+      </w:pPr>
+      <w:r>
+        <w:rPr>
+          <w:rFonts w:ascii="Microsoft YaHei" w:hAnsi="Microsoft YaHei" w:eastAsia="Microsoft YaHei"/>
+        </w:rPr>
+        <w:t>③ 与 ④ 不可混：应用=当堂套真实业务任务（团队层）；IDP=个人 30–60 天行为契约（个人层）。两者模板独立，且都指向真实场景（满足 VR-RE05）。</w:t>
+      </w:r>
+    </w:p>
+    <w:p>
+      <w:pPr>
+        <w:pStyle w:val="Heading2"/>
+      </w:pPr>
+      <w:r>
+        <w:rPr>
+          <w:rFonts w:ascii="Microsoft YaHei" w:hAnsi="Microsoft YaHei" w:eastAsia="Microsoft YaHei"/>
+        </w:rPr>
+        <w:t>四、盲区要点（设计时必须主动覆盖）</w:t>
+      </w:r>
+    </w:p>
+    <w:p>
+      <w:pPr>
+        <w:pStyle w:val="ListNumber"/>
+      </w:pPr>
+      <w:r>
+        <w:rPr>
+          <w:rFonts w:ascii="Microsoft YaHei" w:hAnsi="Microsoft YaHei" w:eastAsia="Microsoft YaHei"/>
+        </w:rPr>
+        <w:t>评价体系分层：L1 决策自评+知识；L2 能力雷达+行为承诺；L3 行为改变追踪+业务指标。</w:t>
+      </w:r>
+    </w:p>
+    <w:p>
+      <w:pPr>
+        <w:pStyle w:val="ListNumber"/>
+      </w:pPr>
+      <w:r>
+        <w:rPr>
+          <w:rFonts w:ascii="Microsoft YaHei" w:hAnsi="Microsoft YaHei" w:eastAsia="Microsoft YaHei"/>
+        </w:rPr>
+        <w:t>C2 独有的【萃取】前置阶段——决定它从「业务目标」而非「现成 PPT」起步。</w:t>
+      </w:r>
+    </w:p>
+    <w:p>
+      <w:pPr>
+        <w:pStyle w:val="ListNumber"/>
+      </w:pPr>
+      <w:r>
+        <w:rPr>
+          <w:rFonts w:ascii="Microsoft YaHei" w:hAnsi="Microsoft YaHei" w:eastAsia="Microsoft YaHei"/>
+        </w:rPr>
+        <w:t>能力模型与水平（Novice→Proficient）：C2 必定义，驱动场景难度与雷达刻度；C1 复用原课程框架。</w:t>
+      </w:r>
+    </w:p>
+    <w:p>
+      <w:pPr>
+        <w:pStyle w:val="ListNumber"/>
+      </w:pPr>
+      <w:r>
+        <w:rPr>
+          <w:rFonts w:ascii="Microsoft YaHei" w:hAnsi="Microsoft YaHei" w:eastAsia="Microsoft YaHei"/>
+        </w:rPr>
+        <w:t>多人课堂运行强度随层递增；L3 需「多线并行+汇合」设计，离线包含同步/汇合节点物料。</w:t>
+      </w:r>
+    </w:p>
+    <w:p>
+      <w:pPr>
+        <w:pStyle w:val="ListNumber"/>
+      </w:pPr>
+      <w:r>
+        <w:rPr>
+          <w:rFonts w:ascii="Microsoft YaHei" w:hAnsi="Microsoft YaHei" w:eastAsia="Microsoft YaHei"/>
+        </w:rPr>
+        <w:t>迁移桥真实场景来源：C1 用行业通用案例，C2 用客户真实业务场景（VR-RE05 都强制）。</w:t>
+      </w:r>
+    </w:p>
+    <w:p>
+      <w:pPr>
+        <w:pStyle w:val="ListNumber"/>
+      </w:pPr>
+      <w:r>
+        <w:rPr>
+          <w:rFonts w:ascii="Microsoft YaHei" w:hAnsi="Microsoft YaHei" w:eastAsia="Microsoft YaHei"/>
+        </w:rPr>
+        <w:t>数据回流（虽线下）：复盘产出物（雷达/IDP）带回做课程迭代，是 C2 护城河。</w:t>
+      </w:r>
+    </w:p>
+    <w:p>
+      <w:pPr>
+        <w:pStyle w:val="ListNumber"/>
+      </w:pPr>
+      <w:r>
+        <w:rPr>
+          <w:rFonts w:ascii="Microsoft YaHei" w:hAnsi="Microsoft YaHei" w:eastAsia="Microsoft YaHei"/>
+        </w:rPr>
+        <w:t>质量门禁分层：L1 放宽叙事深度；L3 强制全量；C2 强制萃取+能力模型校验。</w:t>
+      </w:r>
+    </w:p>
+    <w:p>
+      <w:pPr>
+        <w:pStyle w:val="Heading2"/>
+      </w:pPr>
+      <w:r>
+        <w:rPr>
+          <w:rFonts w:ascii="Microsoft YaHei" w:hAnsi="Microsoft YaHei" w:eastAsia="Microsoft YaHei"/>
+        </w:rPr>
+        <w:t>五、与产品资产映射</w:t>
+      </w:r>
+    </w:p>
+    <w:p>
+      <w:pPr>
+        <w:pStyle w:val="ListBullet"/>
+      </w:pPr>
+      <w:r>
+        <w:rPr>
+          <w:rFonts w:ascii="Microsoft YaHei" w:hAnsi="Microsoft YaHei" w:eastAsia="Microsoft YaHei"/>
+        </w:rPr>
+        <w:t>**Pipeline**：L 决定深度（L1 可简化 Exploration）；C 决定输入（C2 多 Extract 阶段）。</w:t>
+      </w:r>
+    </w:p>
+    <w:p>
+      <w:pPr>
+        <w:pStyle w:val="ListBullet"/>
+      </w:pPr>
+      <w:r>
+        <w:rPr>
+          <w:rFonts w:ascii="Microsoft YaHei" w:hAnsi="Microsoft YaHei" w:eastAsia="Microsoft YaHei"/>
+        </w:rPr>
+        <w:t>**LGM**：L 决定节点密度；C 决定内容来源（现有转译 vs 萃取新建）。</w:t>
+      </w:r>
+    </w:p>
+    <w:p>
+      <w:pPr>
+        <w:pStyle w:val="ListBullet"/>
+      </w:pPr>
+      <w:r>
+        <w:rPr>
+          <w:rFonts w:ascii="Microsoft YaHei" w:hAnsi="Microsoft YaHei" w:eastAsia="Microsoft YaHei"/>
+        </w:rPr>
+        <w:t>**校验**：VR-TIER（时间/分层）+ VR-RE05（应用迁移桥）+ VR-OFF（离线包完整性，按层放宽）。</w:t>
+      </w:r>
+    </w:p>
+    <w:p>
+      <w:pPr>
+        <w:pStyle w:val="ListBullet"/>
+      </w:pPr>
+      <w:r>
+        <w:rPr>
+          <w:rFonts w:ascii="Microsoft YaHei" w:hAnsi="Microsoft YaHei" w:eastAsia="Microsoft YaHei"/>
+        </w:rPr>
+        <w:t>**离线包**：50/50 对应「AVG 组件」 vs 「工作坊组件」（导入卡/复盘手册/应用模板/IDP 卡）。</w:t>
       </w:r>
     </w:p>
     <w:sectPr>

</xml_diff>

<commit_message>
Embed tiering as design requirement + intake gate in main pipeline
- PRD(html/docx) 注入「课程分层 3×2 矩阵（设计要求·前置判定）」章节：Pipeline 新增第0阶段 Course Intake & Tiering
- Sample_Input_Checklist(docx/pptx) 新增第11项「分层与前置判定」自评 + Pipeline 前置示意
- validation_rules.json 增 VR-INTAKE01(BLOCKER, 无分层判定不得进 Pipeline) -> 44条(24B/17W/3I)
- Capability_Assets 重渲染（含 VR-INTAKE01）；Skill 同步已安装副本
- README 更新（前置判定说明 + 44 条）
</commit_message>
<xml_diff>
--- a/docs/Capability_Assets.docx
+++ b/docs/Capability_Assets.docx
@@ -9992,6 +9992,68 @@
           <w:p>
             <w:r>
               <w:t>人工</w:t>
+            </w:r>
+          </w:p>
+        </w:tc>
+      </w:tr>
+      <w:tr>
+        <w:tc>
+          <w:tcPr>
+            <w:tcW w:type="dxa" w:w="1440"/>
+          </w:tcPr>
+          <w:p>
+            <w:r>
+              <w:t>`VR-INTAKE01`</w:t>
+            </w:r>
+          </w:p>
+        </w:tc>
+        <w:tc>
+          <w:tcPr>
+            <w:tcW w:type="dxa" w:w="1440"/>
+          </w:tcPr>
+          <w:p>
+            <w:r>
+              <w:t>`kit.intake`</w:t>
+            </w:r>
+          </w:p>
+        </w:tc>
+        <w:tc>
+          <w:tcPr>
+            <w:tcW w:type="dxa" w:w="1440"/>
+          </w:tcPr>
+          <w:p>
+            <w:r>
+              <w:t>kit.intake 含 tier(L1/L2/L3)、track(C1/C2)、totalDuration、avgDuration(==50%)；无判定不得进入 Pipeline</w:t>
+            </w:r>
+          </w:p>
+        </w:tc>
+        <w:tc>
+          <w:tcPr>
+            <w:tcW w:type="dxa" w:w="1440"/>
+          </w:tcPr>
+          <w:p>
+            <w:r>
+              <w:t>**BLOCKER**</w:t>
+            </w:r>
+          </w:p>
+        </w:tc>
+        <w:tc>
+          <w:tcPr>
+            <w:tcW w:type="dxa" w:w="1440"/>
+          </w:tcPr>
+          <w:p>
+            <w:r>
+              <w:t>课程未完成分层前置判定，禁止进入 Pipeline</w:t>
+            </w:r>
+          </w:p>
+        </w:tc>
+        <w:tc>
+          <w:tcPr>
+            <w:tcW w:type="dxa" w:w="1440"/>
+          </w:tcPr>
+          <w:p>
+            <w:r>
+              <w:t>自动</w:t>
             </w:r>
           </w:p>
         </w:tc>

</xml_diff>